<commit_message>
Add optional extra clause to contracts with a reusable library.
Keep existing Word generation intact and insert paragraph 5 only when the option is enabled, converting B/I/U to DOCX XML.

Co-authored-by: Cursor <cursoragent@cursor.com>
</commit_message>
<xml_diff>
--- a/modulo-contratos/Contrato_ceocard.docx
+++ b/modulo-contratos/Contrato_ceocard.docx
@@ -760,6 +760,8 @@
       <w:r>
         <w:rPr>
           <w:rFonts w:ascii="Aptos Display" w:eastAsia="Times New Roman" w:hAnsi="Aptos Display" w:cs="Times New Roman"/>
+          <w:b/>
+          <w:bCs/>
           <w:sz w:val="25"/>
           <w:szCs w:val="25"/>
         </w:rPr>
@@ -769,6 +771,8 @@
       <w:r>
         <w:rPr>
           <w:rFonts w:ascii="Aptos Display" w:eastAsia="Times New Roman" w:hAnsi="Aptos Display" w:cs="Times New Roman"/>
+          <w:b/>
+          <w:bCs/>
           <w:sz w:val="25"/>
           <w:szCs w:val="25"/>
         </w:rPr>
@@ -778,6 +782,8 @@
       <w:r>
         <w:rPr>
           <w:rFonts w:ascii="Aptos Display" w:eastAsia="Times New Roman" w:hAnsi="Aptos Display" w:cs="Times New Roman"/>
+          <w:b/>
+          <w:bCs/>
           <w:sz w:val="25"/>
           <w:szCs w:val="25"/>
         </w:rPr>
@@ -794,6 +800,8 @@
       <w:r>
         <w:rPr>
           <w:rFonts w:ascii="Aptos Display" w:eastAsia="Times New Roman" w:hAnsi="Aptos Display" w:cs="Times New Roman"/>
+          <w:b/>
+          <w:bCs/>
           <w:sz w:val="25"/>
           <w:szCs w:val="25"/>
         </w:rPr>
@@ -803,6 +811,8 @@
       <w:r>
         <w:rPr>
           <w:rFonts w:ascii="Aptos Display" w:eastAsia="Times New Roman" w:hAnsi="Aptos Display" w:cs="Times New Roman"/>
+          <w:b/>
+          <w:bCs/>
           <w:sz w:val="25"/>
           <w:szCs w:val="25"/>
         </w:rPr>
@@ -812,6 +822,8 @@
       <w:r>
         <w:rPr>
           <w:rFonts w:ascii="Aptos Display" w:eastAsia="Times New Roman" w:hAnsi="Aptos Display" w:cs="Times New Roman"/>
+          <w:b/>
+          <w:bCs/>
           <w:sz w:val="25"/>
           <w:szCs w:val="25"/>
         </w:rPr>
@@ -868,26 +880,176 @@
           <w:sz w:val="25"/>
           <w:szCs w:val="25"/>
         </w:rPr>
-        <w:t> O percentual de 0,99% (zero vírgula noventa e nove por cento) sobre o valor bruto de cada transação de venda realizada e recebida pela CONTRATANTE por meio do SISTEMA CEOCARD.</w:t>
-      </w:r>
-    </w:p>
-    <w:p>
-      <w:pPr>
-        <w:spacing w:before="100" w:beforeAutospacing="1" w:after="100" w:afterAutospacing="1" w:line="240" w:lineRule="auto"/>
-        <w:jc w:val="both"/>
-        <w:rPr>
-          <w:rFonts w:ascii="Aptos Display" w:eastAsia="Times New Roman" w:hAnsi="Aptos Display" w:cs="Times New Roman"/>
-          <w:sz w:val="25"/>
-          <w:szCs w:val="25"/>
-        </w:rPr>
-      </w:pPr>
-      <w:r>
-        <w:rPr>
-          <w:rFonts w:ascii="Aptos Display" w:eastAsia="Times New Roman" w:hAnsi="Aptos Display" w:cs="Times New Roman"/>
-          <w:sz w:val="25"/>
-          <w:szCs w:val="25"/>
-        </w:rPr>
-        <w:t>As faturas (boletos bancários) referentes a essas cobranças serão apresentadas pela CEOCARD e deverão ser pagas pela CONTRATANTE até o dia 5 (cinco) do mês subsequente ao mês de referência dos serviços, sendo os valores calculados com base no total de faturas emitidas e transações processadas até o último dia útil do mês anterior ao vencimento.</w:t>
+        <w:t xml:space="preserve"> O percentual de </w:t>
+      </w:r>
+      <w:r>
+        <w:rPr>
+          <w:rFonts w:ascii="Aptos Display" w:eastAsia="Times New Roman" w:hAnsi="Aptos Display" w:cs="Times New Roman"/>
+          <w:b/>
+          <w:bCs/>
+          <w:sz w:val="25"/>
+          <w:szCs w:val="25"/>
+          <w:highlight w:val="yellow"/>
+        </w:rPr>
+        <w:t>{{</w:t>
+      </w:r>
+      <w:proofErr w:type="spellStart"/>
+      <w:r>
+        <w:rPr>
+          <w:rFonts w:ascii="Aptos Display" w:eastAsia="Times New Roman" w:hAnsi="Aptos Display" w:cs="Times New Roman"/>
+          <w:b/>
+          <w:bCs/>
+          <w:sz w:val="25"/>
+          <w:szCs w:val="25"/>
+          <w:highlight w:val="yellow"/>
+        </w:rPr>
+        <w:t>taxa_transacoes</w:t>
+      </w:r>
+      <w:proofErr w:type="spellEnd"/>
+      <w:r>
+        <w:rPr>
+          <w:rFonts w:ascii="Aptos Display" w:eastAsia="Times New Roman" w:hAnsi="Aptos Display" w:cs="Times New Roman"/>
+          <w:b/>
+          <w:bCs/>
+          <w:sz w:val="25"/>
+          <w:szCs w:val="25"/>
+          <w:highlight w:val="yellow"/>
+        </w:rPr>
+        <w:t>}}</w:t>
+      </w:r>
+      <w:r>
+        <w:rPr>
+          <w:rFonts w:ascii="Aptos Display" w:eastAsia="Times New Roman" w:hAnsi="Aptos Display" w:cs="Times New Roman"/>
+          <w:sz w:val="25"/>
+          <w:szCs w:val="25"/>
+        </w:rPr>
+        <w:t xml:space="preserve"> (</w:t>
+      </w:r>
+      <w:r>
+        <w:rPr>
+          <w:rFonts w:ascii="Aptos Display" w:eastAsia="Times New Roman" w:hAnsi="Aptos Display" w:cs="Times New Roman"/>
+          <w:b/>
+          <w:bCs/>
+          <w:sz w:val="25"/>
+          <w:szCs w:val="25"/>
+          <w:highlight w:val="yellow"/>
+        </w:rPr>
+        <w:t>{{</w:t>
+      </w:r>
+      <w:proofErr w:type="spellStart"/>
+      <w:r>
+        <w:rPr>
+          <w:rFonts w:ascii="Aptos Display" w:eastAsia="Times New Roman" w:hAnsi="Aptos Display" w:cs="Times New Roman"/>
+          <w:b/>
+          <w:bCs/>
+          <w:sz w:val="25"/>
+          <w:szCs w:val="25"/>
+          <w:highlight w:val="yellow"/>
+        </w:rPr>
+        <w:t>taxa_transacoes_extenso</w:t>
+      </w:r>
+      <w:proofErr w:type="spellEnd"/>
+      <w:r>
+        <w:rPr>
+          <w:rFonts w:ascii="Aptos Display" w:eastAsia="Times New Roman" w:hAnsi="Aptos Display" w:cs="Times New Roman"/>
+          <w:b/>
+          <w:bCs/>
+          <w:sz w:val="25"/>
+          <w:szCs w:val="25"/>
+          <w:highlight w:val="yellow"/>
+        </w:rPr>
+        <w:t>}}</w:t>
+      </w:r>
+      <w:r>
+        <w:rPr>
+          <w:rFonts w:ascii="Aptos Display" w:eastAsia="Times New Roman" w:hAnsi="Aptos Display" w:cs="Times New Roman"/>
+          <w:sz w:val="25"/>
+          <w:szCs w:val="25"/>
+        </w:rPr>
+        <w:t>) sobre o valor bruto de cada transação de venda realizada e recebida pela CONTRATANTE por meio do SISTEMA CEOCARD.</w:t>
+      </w:r>
+    </w:p>
+    <w:p>
+      <w:pPr>
+        <w:spacing w:before="100" w:beforeAutospacing="1" w:after="100" w:afterAutospacing="1" w:line="240" w:lineRule="auto"/>
+        <w:jc w:val="both"/>
+        <w:rPr>
+          <w:rFonts w:ascii="Aptos Display" w:eastAsia="Times New Roman" w:hAnsi="Aptos Display" w:cs="Times New Roman"/>
+          <w:sz w:val="25"/>
+          <w:szCs w:val="25"/>
+        </w:rPr>
+      </w:pPr>
+      <w:r>
+        <w:rPr>
+          <w:rFonts w:ascii="Aptos Display" w:eastAsia="Times New Roman" w:hAnsi="Aptos Display" w:cs="Times New Roman"/>
+          <w:sz w:val="25"/>
+          <w:szCs w:val="25"/>
+        </w:rPr>
+        <w:t xml:space="preserve">As </w:t>
+      </w:r>
+      <w:r>
+        <w:rPr>
+          <w:rFonts w:ascii="Aptos Display" w:eastAsia="Times New Roman" w:hAnsi="Aptos Display" w:cs="Times New Roman"/>
+          <w:b/>
+          <w:bCs/>
+          <w:sz w:val="25"/>
+          <w:szCs w:val="25"/>
+        </w:rPr>
+        <w:t>faturas</w:t>
+      </w:r>
+      <w:r>
+        <w:rPr>
+          <w:rFonts w:ascii="Aptos Display" w:eastAsia="Times New Roman" w:hAnsi="Aptos Display" w:cs="Times New Roman"/>
+          <w:sz w:val="25"/>
+          <w:szCs w:val="25"/>
+        </w:rPr>
+        <w:t xml:space="preserve"> (boletos bancários) referentes a essas cobranças serão apresentadas pela CEOCARD e </w:t>
+      </w:r>
+      <w:r>
+        <w:rPr>
+          <w:rFonts w:ascii="Aptos Display" w:eastAsia="Times New Roman" w:hAnsi="Aptos Display" w:cs="Times New Roman"/>
+          <w:b/>
+          <w:bCs/>
+          <w:sz w:val="25"/>
+          <w:szCs w:val="25"/>
+        </w:rPr>
+        <w:t>deverão</w:t>
+      </w:r>
+      <w:r>
+        <w:rPr>
+          <w:rFonts w:ascii="Aptos Display" w:eastAsia="Times New Roman" w:hAnsi="Aptos Display" w:cs="Times New Roman"/>
+          <w:b/>
+          <w:bCs/>
+          <w:sz w:val="25"/>
+          <w:szCs w:val="25"/>
+        </w:rPr>
+        <w:t xml:space="preserve"> ser pagas pela CONTRATANTE</w:t>
+      </w:r>
+      <w:r>
+        <w:rPr>
+          <w:rFonts w:ascii="Aptos Display" w:eastAsia="Times New Roman" w:hAnsi="Aptos Display" w:cs="Times New Roman"/>
+          <w:sz w:val="25"/>
+          <w:szCs w:val="25"/>
+        </w:rPr>
+        <w:t xml:space="preserve"> </w:t>
+      </w:r>
+      <w:r>
+        <w:rPr>
+          <w:rFonts w:ascii="Aptos Display" w:eastAsia="Times New Roman" w:hAnsi="Aptos Display" w:cs="Times New Roman"/>
+          <w:b/>
+          <w:bCs/>
+          <w:sz w:val="25"/>
+          <w:szCs w:val="25"/>
+        </w:rPr>
+        <w:t>até o dia 5 (cinco) do mês subsequente ao mês de referência dos serviços</w:t>
+      </w:r>
+      <w:r>
+        <w:rPr>
+          <w:rFonts w:ascii="Aptos Display" w:eastAsia="Times New Roman" w:hAnsi="Aptos Display" w:cs="Times New Roman"/>
+          <w:sz w:val="25"/>
+          <w:szCs w:val="25"/>
+        </w:rPr>
+        <w:t>, sendo os valores calculados com base no total de faturas emitidas e transações processadas até o último dia útil do mês anterior ao vencimento.</w:t>
       </w:r>
     </w:p>
     <w:p>
@@ -1190,39 +1352,185 @@
           <w:sz w:val="25"/>
           <w:szCs w:val="25"/>
         </w:rPr>
-        <w:t xml:space="preserve">4. As consultas e/ou inclusões nos bancos de dados de proteção ao crédito (SPC e/ou Serasa) realizadas pela CEOCARD serão cobradas individualmente, no valor de R$ </w:t>
-      </w:r>
-      <w:r>
-        <w:rPr>
-          <w:rFonts w:ascii="Aptos Display" w:eastAsia="Times New Roman" w:hAnsi="Aptos Display" w:cs="Times New Roman"/>
-          <w:sz w:val="25"/>
-          <w:szCs w:val="25"/>
-        </w:rPr>
-        <w:t>9</w:t>
-      </w:r>
-      <w:r>
-        <w:rPr>
-          <w:rFonts w:ascii="Aptos Display" w:eastAsia="Times New Roman" w:hAnsi="Aptos Display" w:cs="Times New Roman"/>
-          <w:sz w:val="25"/>
-          <w:szCs w:val="25"/>
-        </w:rPr>
-        <w:t>,99 (</w:t>
-      </w:r>
-      <w:r>
-        <w:rPr>
-          <w:rFonts w:ascii="Aptos Display" w:eastAsia="Times New Roman" w:hAnsi="Aptos Display" w:cs="Times New Roman"/>
-          <w:sz w:val="25"/>
-          <w:szCs w:val="25"/>
-        </w:rPr>
-        <w:t>Nove</w:t>
-      </w:r>
-      <w:r>
-        <w:rPr>
-          <w:rFonts w:ascii="Aptos Display" w:eastAsia="Times New Roman" w:hAnsi="Aptos Display" w:cs="Times New Roman"/>
-          <w:sz w:val="25"/>
-          <w:szCs w:val="25"/>
-        </w:rPr>
-        <w:t xml:space="preserve"> Reais e Noventa e Nove Centavos) por cada operação (consulta ou inclusão), e serão discriminadas na fatura mensal enviada pela CEOCARD.</w:t>
+        <w:t xml:space="preserve">4. As consultas e/ou inclusões nos bancos de dados de proteção ao crédito (SPC e/ou Serasa) realizadas pela CEOCARD serão cobradas individualmente, no valor de </w:t>
+      </w:r>
+      <w:r>
+        <w:rPr>
+          <w:rFonts w:ascii="Aptos Display" w:eastAsia="Times New Roman" w:hAnsi="Aptos Display" w:cs="Times New Roman"/>
+          <w:b/>
+          <w:bCs/>
+          <w:sz w:val="25"/>
+          <w:szCs w:val="25"/>
+        </w:rPr>
+        <w:t xml:space="preserve">R$ </w:t>
+      </w:r>
+      <w:r>
+        <w:rPr>
+          <w:rFonts w:ascii="Aptos Display" w:eastAsia="Times New Roman" w:hAnsi="Aptos Display" w:cs="Times New Roman"/>
+          <w:b/>
+          <w:bCs/>
+          <w:sz w:val="25"/>
+          <w:szCs w:val="25"/>
+          <w:highlight w:val="yellow"/>
+        </w:rPr>
+        <w:t>{{</w:t>
+      </w:r>
+      <w:proofErr w:type="spellStart"/>
+      <w:r>
+        <w:rPr>
+          <w:rFonts w:ascii="Aptos Display" w:eastAsia="Times New Roman" w:hAnsi="Aptos Display" w:cs="Times New Roman"/>
+          <w:b/>
+          <w:bCs/>
+          <w:sz w:val="25"/>
+          <w:szCs w:val="25"/>
+          <w:highlight w:val="yellow"/>
+        </w:rPr>
+        <w:t>taxa_spc</w:t>
+      </w:r>
+      <w:proofErr w:type="spellEnd"/>
+      <w:r>
+        <w:rPr>
+          <w:rFonts w:ascii="Aptos Display" w:eastAsia="Times New Roman" w:hAnsi="Aptos Display" w:cs="Times New Roman"/>
+          <w:b/>
+          <w:bCs/>
+          <w:sz w:val="25"/>
+          <w:szCs w:val="25"/>
+          <w:highlight w:val="yellow"/>
+        </w:rPr>
+        <w:t>}}</w:t>
+      </w:r>
+      <w:r>
+        <w:rPr>
+          <w:rFonts w:ascii="Aptos Display" w:eastAsia="Times New Roman" w:hAnsi="Aptos Display" w:cs="Times New Roman"/>
+          <w:b/>
+          <w:bCs/>
+          <w:sz w:val="25"/>
+          <w:szCs w:val="25"/>
+          <w:highlight w:val="yellow"/>
+        </w:rPr>
+        <w:t xml:space="preserve"> </w:t>
+      </w:r>
+      <w:r>
+        <w:rPr>
+          <w:rFonts w:ascii="Aptos Display" w:eastAsia="Times New Roman" w:hAnsi="Aptos Display" w:cs="Times New Roman"/>
+          <w:sz w:val="25"/>
+          <w:szCs w:val="25"/>
+          <w:highlight w:val="yellow"/>
+        </w:rPr>
+        <w:t>(</w:t>
+      </w:r>
+      <w:r>
+        <w:rPr>
+          <w:rFonts w:ascii="Aptos Display" w:eastAsia="Times New Roman" w:hAnsi="Aptos Display" w:cs="Times New Roman"/>
+          <w:b/>
+          <w:bCs/>
+          <w:sz w:val="25"/>
+          <w:szCs w:val="25"/>
+          <w:highlight w:val="yellow"/>
+        </w:rPr>
+        <w:t>{{</w:t>
+      </w:r>
+      <w:proofErr w:type="spellStart"/>
+      <w:r>
+        <w:rPr>
+          <w:rFonts w:ascii="Aptos Display" w:eastAsia="Times New Roman" w:hAnsi="Aptos Display" w:cs="Times New Roman"/>
+          <w:b/>
+          <w:bCs/>
+          <w:sz w:val="25"/>
+          <w:szCs w:val="25"/>
+          <w:highlight w:val="yellow"/>
+        </w:rPr>
+        <w:t>taxa_spc_extenso</w:t>
+      </w:r>
+      <w:proofErr w:type="spellEnd"/>
+      <w:r>
+        <w:rPr>
+          <w:rFonts w:ascii="Aptos Display" w:eastAsia="Times New Roman" w:hAnsi="Aptos Display" w:cs="Times New Roman"/>
+          <w:b/>
+          <w:bCs/>
+          <w:sz w:val="25"/>
+          <w:szCs w:val="25"/>
+          <w:highlight w:val="yellow"/>
+        </w:rPr>
+        <w:t>}}</w:t>
+      </w:r>
+      <w:r>
+        <w:rPr>
+          <w:rFonts w:ascii="Aptos Display" w:eastAsia="Times New Roman" w:hAnsi="Aptos Display" w:cs="Times New Roman"/>
+          <w:sz w:val="25"/>
+          <w:szCs w:val="25"/>
+        </w:rPr>
+        <w:t xml:space="preserve">) por cada operação (consulta ou inclusão), e serão discriminadas na fatura mensal enviada pela </w:t>
+      </w:r>
+      <w:r>
+        <w:rPr>
+          <w:rFonts w:ascii="Aptos Display" w:eastAsia="Times New Roman" w:hAnsi="Aptos Display" w:cs="Times New Roman"/>
+          <w:sz w:val="25"/>
+          <w:szCs w:val="25"/>
+        </w:rPr>
+        <w:t>CEOCARD</w:t>
+      </w:r>
+      <w:r>
+        <w:rPr>
+          <w:rFonts w:ascii="Aptos Display" w:eastAsia="Times New Roman" w:hAnsi="Aptos Display" w:cs="Times New Roman"/>
+          <w:sz w:val="25"/>
+          <w:szCs w:val="25"/>
+        </w:rPr>
+        <w:t>.</w:t>
+      </w:r>
+    </w:p>
+    <w:p>
+      <w:pPr>
+        <w:spacing w:before="0" w:after="0" w:line="240" w:lineRule="auto"/>
+        <w:rPr>
+          <w:rFonts w:ascii="Aptos Display" w:eastAsia="Times New Roman" w:hAnsi="Aptos Display" w:cs="Times New Roman"/>
+          <w:sz w:val="25"/>
+          <w:szCs w:val="25"/>
+        </w:rPr>
+      </w:pPr>
+      <w:r>
+        <w:rPr>
+          <w:rFonts w:ascii="Aptos Display" w:eastAsia="Times New Roman" w:hAnsi="Aptos Display" w:cs="Times New Roman"/>
+          <w:sz w:val="25"/>
+          <w:szCs w:val="25"/>
+        </w:rPr>
+        <w:t>{{#clausula_opcional}}</w:t>
+      </w:r>
+    </w:p>
+    <w:p>
+      <w:pPr>
+        <w:spacing w:before="0" w:after="0" w:line="240" w:lineRule="auto"/>
+        <w:rPr>
+          <w:rFonts w:ascii="Aptos Display" w:eastAsia="Times New Roman" w:hAnsi="Aptos Display" w:cs="Times New Roman"/>
+          <w:sz w:val="25"/>
+          <w:szCs w:val="25"/>
+        </w:rPr>
+      </w:pPr>
+      <w:r>
+        <w:rPr>
+          <w:rFonts w:ascii="Aptos Display" w:eastAsia="Times New Roman" w:hAnsi="Aptos Display" w:cs="Times New Roman"/>
+          <w:sz w:val="25"/>
+          <w:szCs w:val="25"/>
+        </w:rPr>
+        <w:t>{{@clausula_opcional_xml}}</w:t>
+      </w:r>
+    </w:p>
+    <w:p>
+      <w:pPr>
+        <w:spacing w:before="0" w:after="0" w:line="240" w:lineRule="auto"/>
+        <w:rPr>
+          <w:rFonts w:ascii="Aptos Display" w:eastAsia="Times New Roman" w:hAnsi="Aptos Display" w:cs="Times New Roman"/>
+          <w:sz w:val="25"/>
+          <w:szCs w:val="25"/>
+        </w:rPr>
+      </w:pPr>
+      <w:r>
+        <w:rPr>
+          <w:rFonts w:ascii="Aptos Display" w:eastAsia="Times New Roman" w:hAnsi="Aptos Display" w:cs="Times New Roman"/>
+          <w:sz w:val="25"/>
+          <w:szCs w:val="25"/>
+        </w:rPr>
+        <w:t>{{/clausula_opcional}}</w:t>
       </w:r>
     </w:p>
     <w:p>
@@ -3586,84 +3894,6 @@
           <w:szCs w:val="24"/>
         </w:rPr>
       </w:pPr>
-    </w:p>
-    <w:p>
-      <w:pPr>
-        <w:spacing w:before="100" w:beforeAutospacing="1" w:after="100" w:afterAutospacing="1" w:line="240" w:lineRule="auto"/>
-        <w:jc w:val="both"/>
-        <w:rPr>
-          <w:rFonts w:ascii="Aptos Display" w:eastAsia="Times New Roman" w:hAnsi="Aptos Display" w:cs="Times New Roman"/>
-          <w:i/>
-          <w:sz w:val="24"/>
-          <w:szCs w:val="24"/>
-        </w:rPr>
-      </w:pPr>
-      <w:r>
-        <w:rPr>
-          <w:rFonts w:ascii="Aptos Display" w:eastAsia="Times New Roman" w:hAnsi="Aptos Display" w:cs="Times New Roman"/>
-          <w:i/>
-          <w:sz w:val="24"/>
-          <w:szCs w:val="24"/>
-        </w:rPr>
-        <w:t>Colocar aqui a lista com o Nome completo, CPF, endereço completo dos clientes/</w:t>
-      </w:r>
-      <w:r>
-        <w:rPr>
-          <w:rFonts w:ascii="Aptos Display" w:eastAsia="Times New Roman" w:hAnsi="Aptos Display" w:cs="Times New Roman"/>
-          <w:i/>
-          <w:sz w:val="24"/>
-          <w:szCs w:val="24"/>
-        </w:rPr>
-        <w:t xml:space="preserve">devedores </w:t>
-      </w:r>
-      <w:r>
-        <w:rPr>
-          <w:rFonts w:ascii="Aptos Display" w:eastAsia="Times New Roman" w:hAnsi="Aptos Display" w:cs="Times New Roman"/>
-          <w:i/>
-          <w:sz w:val="24"/>
-          <w:szCs w:val="24"/>
-        </w:rPr>
-        <w:t>e</w:t>
-      </w:r>
-      <w:r>
-        <w:rPr>
-          <w:rFonts w:ascii="Aptos Display" w:eastAsia="Times New Roman" w:hAnsi="Aptos Display" w:cs="Times New Roman"/>
-          <w:i/>
-          <w:sz w:val="24"/>
-          <w:szCs w:val="24"/>
-        </w:rPr>
-        <w:t xml:space="preserve"> </w:t>
-      </w:r>
-      <w:r>
-        <w:rPr>
-          <w:rFonts w:ascii="Aptos Display" w:eastAsia="Times New Roman" w:hAnsi="Aptos Display" w:cs="Times New Roman"/>
-          <w:b/>
-          <w:i/>
-          <w:sz w:val="24"/>
-          <w:szCs w:val="24"/>
-        </w:rPr>
-        <w:t xml:space="preserve">DATA DA </w:t>
-      </w:r>
-      <w:r>
-        <w:rPr>
-          <w:rFonts w:ascii="Aptos Display" w:eastAsia="Times New Roman" w:hAnsi="Aptos Display" w:cs="Times New Roman"/>
-          <w:b/>
-          <w:i/>
-          <w:sz w:val="24"/>
-          <w:szCs w:val="24"/>
-        </w:rPr>
-        <w:t>DÍVIDA</w:t>
-      </w:r>
-      <w:r>
-        <w:rPr>
-          <w:rFonts w:ascii="Aptos Display" w:eastAsia="Times New Roman" w:hAnsi="Aptos Display" w:cs="Times New Roman"/>
-          <w:b/>
-          <w:i/>
-          <w:sz w:val="24"/>
-          <w:szCs w:val="24"/>
-        </w:rPr>
-        <w:t xml:space="preserve"> ORIGINAL</w:t>
-      </w:r>
     </w:p>
     <w:p>
       <w:pPr>
@@ -6258,7 +6488,6 @@
   <w:style w:type="character" w:default="1" w:styleId="Fontepargpadro">
     <w:name w:val="Default Paragraph Font"/>
     <w:uiPriority w:val="1"/>
-    <w:semiHidden/>
     <w:unhideWhenUsed/>
   </w:style>
   <w:style w:type="table" w:default="1" w:styleId="Tabelanormal">

</xml_diff>